<commit_message>
docs: finalize document review status
</commit_message>
<xml_diff>
--- a/doc/doc/新能源企业出海导航仪_首批数据采集实施方案_BASELINE.docx
+++ b/doc/doc/新能源企业出海导航仪_首批数据采集实施方案_BASELINE.docx
@@ -342,7 +342,7 @@
           <w:color w:val="5B6573"/>
           <w:sz w:val="19"/>
         </w:rPr>
-        <w:t>编制日期：2026年7月24日　｜　状态：已确认，D0已启动</w:t>
+        <w:t>编制日期：2026年7月24日　｜　审核完成：2026年7月30日　｜　D0已启动</w:t>
       </w:r>
     </w:p>
     <w:p>
@@ -362,7 +362,7 @@
           <w:color w:val="0B2545"/>
           <w:sz w:val="22"/>
         </w:rPr>
-        <w:t>版本：V1.0-BASELINE（已确认）</w:t>
+        <w:t>版本：V1.0-BASELINE（文档审核已完成并冻结）</w:t>
       </w:r>
     </w:p>
     <w:p>

</xml_diff>